<commit_message>
Engineer-first CV rewrite (skills first, lessons learned, ATS-safe) + matching portfolio positioning
- CV content moved to tools/cv-content.json; layout in tools/build-cv.py (single column, standard headings, ASCII sanitizer, availability line, highlights strip)
- Summary: engineer seeking a team, founder experience as credential, grateful, learned from mistakes
- Technical Skills first; Languages and Frameworks separate; Cloud (Vercel, Supabase, AWS, Azure, Docker, Linux)
- Buying Coordinator and powerlifting sections removed; Leadership section with initiative, responsibility, standards
- Titles: Software Engineer & Founder (Vextora), Lead Software Engineer & Founder (IronOS)
- Portfolio: engineer-first hero/tagline/titles, Founder Experience section with lessons learned, meta + README aligned
- Resume cache-buster bumped to v=20260916

Co-Authored-By: Claude Fable 5.1 <noreply@anthropic.com>
</commit_message>
<xml_diff>
--- a/public/Mustafa-Hadi-Resume.docx
+++ b/public/Mustafa-Hadi-Resume.docx
@@ -24,10 +24,25 @@
       </w:pPr>
       <w:r>
         <w:rPr>
+          <w:b/>
+          <w:i w:val="0"/>
+          <w:color w:val="404040"/>
+          <w:sz w:val="19"/>
+        </w:rPr>
+        <w:t>Software Engineer (Full-Stack, Cloud, Automation)  |  B.S. Software Engineering, WGU, Expected Jan 2027</w:t>
+      </w:r>
+    </w:p>
+    <w:p>
+      <w:pPr>
+        <w:spacing w:before="0" w:after="0"/>
+        <w:jc w:val="center"/>
+      </w:pPr>
+      <w:r>
+        <w:rPr>
           <w:b w:val="0"/>
           <w:i w:val="0"/>
         </w:rPr>
-        <w:t xml:space="preserve">Clive, IA 50325  |  (515) 444-6495  |  </w:t>
+        <w:t xml:space="preserve">Clive, IA (Des Moines metro)  |  (515) 444-6495  |  </w:t>
       </w:r>
       <w:hyperlink r:id="rId9">
         <w:r>
@@ -43,12 +58,12 @@
           <w:b w:val="0"/>
           <w:i w:val="0"/>
         </w:rPr>
-        <w:t xml:space="preserve">  |  U.S. Citizen</w:t>
+        <w:t xml:space="preserve">  |  U.S. Citizen (no sponsorship required)</w:t>
       </w:r>
     </w:p>
     <w:p>
       <w:pPr>
-        <w:spacing w:before="0" w:after="40"/>
+        <w:spacing w:before="0" w:after="0"/>
         <w:jc w:val="center"/>
       </w:pPr>
       <w:hyperlink r:id="rId10">
@@ -95,7 +110,32 @@
     </w:p>
     <w:p>
       <w:pPr>
-        <w:spacing w:before="60" w:after="20"/>
+        <w:spacing w:before="0" w:after="40"/>
+        <w:jc w:val="center"/>
+        <w:pBdr>
+          <w:bottom w:val="single" w:sz="8" w:space="1" w:color="8B0000"/>
+        </w:pBdr>
+      </w:pPr>
+      <w:r>
+        <w:rPr>
+          <w:b/>
+          <w:i w:val="0"/>
+          <w:color w:val="404040"/>
+        </w:rPr>
+        <w:t xml:space="preserve">Availability: </w:t>
+      </w:r>
+      <w:r>
+        <w:rPr>
+          <w:b w:val="0"/>
+          <w:i/>
+          <w:color w:val="404040"/>
+        </w:rPr>
+        <w:t>Part-time now, full-time from Jan 2027 (internship or new-grad)  |  On-site, hybrid, or remote  |  Relocation within Iowa</w:t>
+      </w:r>
+    </w:p>
+    <w:p>
+      <w:pPr>
+        <w:spacing w:before="40" w:after="20"/>
         <w:pBdr>
           <w:bottom w:val="single" w:sz="6" w:space="1" w:color="8B0000"/>
         </w:pBdr>
@@ -105,26 +145,99 @@
           <w:b/>
           <w:i w:val="0"/>
           <w:color w:val="8B0000"/>
-          <w:sz w:val="21"/>
+          <w:sz w:val="20"/>
         </w:rPr>
-        <w:t>SUMMARY</w:t>
+        <w:t>PROFESSIONAL SUMMARY</w:t>
       </w:r>
     </w:p>
     <w:p>
       <w:pPr>
-        <w:spacing w:before="0" w:after="20"/>
+        <w:spacing w:before="0" w:after="40"/>
       </w:pPr>
       <w:r>
         <w:rPr>
           <w:b w:val="0"/>
           <w:i w:val="0"/>
         </w:rPr>
-        <w:t>Founder-engineer and WGU Software Engineering student (B.S. expected Jan 2027) seeking a Software Engineering internship in Iowa. Founder of Vextora AI Solutions and IronOS: I ship production systems end to end with Next.js/TypeScript, Supabase/PostgreSQL, Stripe, and n8n on Vercel, AWS, and Azure.</w:t>
+        <w:t>Software engineering student (B.S. expected Jan 2027) seeking a Software Engineering internship in the Des Moines, Iowa metro or a new-grad role from Jan 2027. Shipping two production applications end to end, mistakes included, taught me to validate before building, test before shipping, keep safety gates on by default, and communicate early with non-technical stakeholders. I am grateful for that chance and want to join a team where I can learn its standards from senior engineers I look up to.</w:t>
       </w:r>
     </w:p>
     <w:p>
       <w:pPr>
-        <w:spacing w:before="60" w:after="20"/>
+        <w:spacing w:before="0" w:after="20"/>
+        <w:jc w:val="center"/>
+      </w:pPr>
+      <w:r>
+        <w:rPr>
+          <w:b/>
+          <w:i w:val="0"/>
+        </w:rPr>
+        <w:t>1,628 unit tests passing</w:t>
+      </w:r>
+      <w:r>
+        <w:rPr>
+          <w:b w:val="0"/>
+          <w:i w:val="0"/>
+          <w:color w:val="8B0000"/>
+        </w:rPr>
+        <w:t xml:space="preserve">   |   </w:t>
+      </w:r>
+      <w:r>
+        <w:rPr>
+          <w:b/>
+          <w:i w:val="0"/>
+        </w:rPr>
+        <w:t>7,000+ records in PostgreSQL</w:t>
+      </w:r>
+      <w:r>
+        <w:rPr>
+          <w:b w:val="0"/>
+          <w:i w:val="0"/>
+          <w:color w:val="8B0000"/>
+        </w:rPr>
+        <w:t xml:space="preserve">   |   </w:t>
+      </w:r>
+      <w:r>
+        <w:rPr>
+          <w:b/>
+          <w:i w:val="0"/>
+        </w:rPr>
+        <w:t>3 production deployments</w:t>
+      </w:r>
+      <w:r>
+        <w:rPr>
+          <w:b w:val="0"/>
+          <w:i w:val="0"/>
+          <w:color w:val="8B0000"/>
+        </w:rPr>
+        <w:t xml:space="preserve">   |   </w:t>
+      </w:r>
+      <w:r>
+        <w:rPr>
+          <w:b/>
+          <w:i w:val="0"/>
+        </w:rPr>
+        <w:t>Client site + CMS delivered</w:t>
+      </w:r>
+      <w:r>
+        <w:rPr>
+          <w:b w:val="0"/>
+          <w:i w:val="0"/>
+          <w:color w:val="8B0000"/>
+        </w:rPr>
+        <w:t xml:space="preserve">   |   </w:t>
+      </w:r>
+      <w:r>
+        <w:rPr>
+          <w:b/>
+          <w:i w:val="0"/>
+        </w:rPr>
+        <w:t>1,400+ commits</w:t>
+      </w:r>
+    </w:p>
+    <w:p>
+      <w:pPr>
+        <w:spacing w:before="40" w:after="20"/>
         <w:pBdr>
           <w:bottom w:val="single" w:sz="6" w:space="1" w:color="8B0000"/>
         </w:pBdr>
@@ -134,531 +247,9 @@
           <w:b/>
           <w:i w:val="0"/>
           <w:color w:val="8B0000"/>
-          <w:sz w:val="21"/>
+          <w:sz w:val="20"/>
         </w:rPr>
-        <w:t>EDUCATION</w:t>
-      </w:r>
-    </w:p>
-    <w:p>
-      <w:pPr>
-        <w:tabs>
-          <w:tab w:pos="11088" w:val="right"/>
-        </w:tabs>
-        <w:spacing w:before="60" w:after="0"/>
-      </w:pPr>
-      <w:r>
-        <w:rPr>
-          <w:b/>
-          <w:i w:val="0"/>
-        </w:rPr>
-        <w:t>Western Governors University</w:t>
-      </w:r>
-      <w:r>
-        <w:rPr>
-          <w:b/>
-          <w:i w:val="0"/>
-        </w:rPr>
-        <w:t xml:space="preserve"> — B.S. Software Engineering (Clive, IA)</w:t>
-      </w:r>
-      <w:r>
-        <w:rPr>
-          <w:b w:val="0"/>
-          <w:i/>
-        </w:rPr>
-        <w:tab/>
-        <w:t>Expected Jan 2027</w:t>
-      </w:r>
-    </w:p>
-    <w:p>
-      <w:pPr>
-        <w:spacing w:before="60" w:after="20"/>
-        <w:pBdr>
-          <w:bottom w:val="single" w:sz="6" w:space="1" w:color="8B0000"/>
-        </w:pBdr>
-      </w:pPr>
-      <w:r>
-        <w:rPr>
-          <w:b/>
-          <w:i w:val="0"/>
-          <w:color w:val="8B0000"/>
-          <w:sz w:val="21"/>
-        </w:rPr>
-        <w:t>CERTIFICATIONS</w:t>
-      </w:r>
-    </w:p>
-    <w:p>
-      <w:pPr>
-        <w:spacing w:after="10"/>
-        <w:ind w:left="245" w:hanging="173"/>
-      </w:pPr>
-      <w:r>
-        <w:rPr>
-          <w:b w:val="0"/>
-          <w:i w:val="0"/>
-        </w:rPr>
-        <w:t>•  Harvard CS50: Introduction to Computer Science, Python, and SQL — Completed Dec 2024</w:t>
-      </w:r>
-    </w:p>
-    <w:p>
-      <w:pPr>
-        <w:spacing w:after="10"/>
-        <w:ind w:left="245" w:hanging="173"/>
-      </w:pPr>
-      <w:r>
-        <w:rPr>
-          <w:b w:val="0"/>
-          <w:i w:val="0"/>
-        </w:rPr>
-        <w:t>•  Expected Jan 2027: AWS Certified Cloud Practitioner · CompTIA Project+ · AXELOS ITIL 4 Foundation · CIW JavaScript Specialist · CIW User Interface Designer · CIW Advanced HTML5 &amp; CSS3 Specialist · WGU Certified Front-End &amp; Back-End Developer</w:t>
-      </w:r>
-    </w:p>
-    <w:p>
-      <w:pPr>
-        <w:spacing w:before="60" w:after="20"/>
-        <w:pBdr>
-          <w:bottom w:val="single" w:sz="6" w:space="1" w:color="8B0000"/>
-        </w:pBdr>
-      </w:pPr>
-      <w:r>
-        <w:rPr>
-          <w:b/>
-          <w:i w:val="0"/>
-          <w:color w:val="8B0000"/>
-          <w:sz w:val="21"/>
-        </w:rPr>
-        <w:t>EXPERIENCE</w:t>
-      </w:r>
-    </w:p>
-    <w:p>
-      <w:pPr>
-        <w:tabs>
-          <w:tab w:pos="11088" w:val="right"/>
-        </w:tabs>
-        <w:spacing w:before="60" w:after="0"/>
-      </w:pPr>
-      <w:r>
-        <w:rPr>
-          <w:b/>
-          <w:i w:val="0"/>
-        </w:rPr>
-        <w:t>Founder &amp; Software Engineer</w:t>
-      </w:r>
-      <w:r>
-        <w:rPr>
-          <w:b/>
-          <w:i w:val="0"/>
-        </w:rPr>
-        <w:t xml:space="preserve"> — Vextora AI Solutions</w:t>
-      </w:r>
-      <w:r>
-        <w:rPr>
-          <w:b w:val="0"/>
-          <w:i/>
-        </w:rPr>
-        <w:tab/>
-        <w:t>Clive, IA  ·  Apr 2026 – Present</w:t>
-      </w:r>
-    </w:p>
-    <w:p>
-      <w:pPr>
-        <w:spacing w:before="0" w:after="0"/>
-      </w:pPr>
-      <w:r>
-        <w:rPr>
-          <w:b w:val="0"/>
-          <w:i/>
-          <w:color w:val="404040"/>
-        </w:rPr>
-        <w:t>AI-powered web presence and lead-generation agency for local service businesses; I build and operate every layer.</w:t>
-      </w:r>
-    </w:p>
-    <w:p>
-      <w:pPr>
-        <w:spacing w:after="10"/>
-        <w:ind w:left="245" w:hanging="173"/>
-      </w:pPr>
-      <w:r>
-        <w:rPr>
-          <w:b w:val="0"/>
-          <w:i w:val="0"/>
-        </w:rPr>
-        <w:t>•  Shipped production client websites and an admin CMS with Next.js, TypeScript, Tailwind, and Supabase (PostgreSQL, Auth, Row-Level Security) on Vercel with preview and production environments; closed and delivered the agency's first paying client.</w:t>
-      </w:r>
-    </w:p>
-    <w:p>
-      <w:pPr>
-        <w:spacing w:after="10"/>
-        <w:ind w:left="245" w:hanging="173"/>
-      </w:pPr>
-      <w:r>
-        <w:rPr>
-          <w:b w:val="0"/>
-          <w:i w:val="0"/>
-        </w:rPr>
-        <w:t>•  Designed a multi-tenant PostgreSQL schema (leads, deals, contracts, commissions, events) behind a 7,000+ lead CRM; built a Python scraping and dedupe pipeline and a sales-rep portal with magic-link auth, clickwrap e-signature, Stripe deposit links, and webhook-verified payments.</w:t>
-      </w:r>
-    </w:p>
-    <w:p>
-      <w:pPr>
-        <w:spacing w:after="10"/>
-        <w:ind w:left="245" w:hanging="173"/>
-      </w:pPr>
-      <w:r>
-        <w:rPr>
-          <w:b w:val="0"/>
-          <w:i w:val="0"/>
-        </w:rPr>
-        <w:t>•  Automated research, scoring, outreach drafting, and nurture (n8n in Docker, Node scripts, Resend + Calendly webhooks on Vercel Cron) behind a default-deny send gate with a TCPA / CAN-SPAM compliance checklist.</w:t>
-      </w:r>
-    </w:p>
-    <w:p>
-      <w:pPr>
-        <w:spacing w:after="10"/>
-        <w:ind w:left="245" w:hanging="173"/>
-      </w:pPr>
-      <w:r>
-        <w:rPr>
-          <w:b w:val="0"/>
-          <w:i w:val="0"/>
-        </w:rPr>
-        <w:t>•  Architected a standalone Microsoft Azure stack (App Service, Azure Database for PostgreSQL + pgvector, Entra External ID, Blob Storage) for a healthcare-adjacent client and evaluated AWS alternatives for cost and compliance.</w:t>
-      </w:r>
-    </w:p>
-    <w:p>
-      <w:pPr>
-        <w:tabs>
-          <w:tab w:pos="11088" w:val="right"/>
-        </w:tabs>
-        <w:spacing w:before="60" w:after="0"/>
-      </w:pPr>
-      <w:r>
-        <w:rPr>
-          <w:b/>
-          <w:i w:val="0"/>
-        </w:rPr>
-        <w:t>Founder &amp; Lead Engineer</w:t>
-      </w:r>
-      <w:r>
-        <w:rPr>
-          <w:b/>
-          <w:i w:val="0"/>
-        </w:rPr>
-        <w:t xml:space="preserve"> — IronOS</w:t>
-      </w:r>
-      <w:r>
-        <w:rPr>
-          <w:b w:val="0"/>
-          <w:i/>
-        </w:rPr>
-        <w:tab/>
-        <w:t>Remote  ·  Apr 2026 – Present</w:t>
-      </w:r>
-    </w:p>
-    <w:p>
-      <w:pPr>
-        <w:spacing w:before="0" w:after="0"/>
-      </w:pPr>
-      <w:r>
-        <w:rPr>
-          <w:b w:val="0"/>
-          <w:i/>
-          <w:color w:val="404040"/>
-        </w:rPr>
-        <w:t>SaaS platform that gives powerlifting coaches an AI content engine, client onboarding, and subscription billing.</w:t>
-      </w:r>
-    </w:p>
-    <w:p>
-      <w:pPr>
-        <w:spacing w:after="10"/>
-        <w:ind w:left="245" w:hanging="173"/>
-      </w:pPr>
-      <w:r>
-        <w:rPr>
-          <w:b w:val="0"/>
-          <w:i w:val="0"/>
-        </w:rPr>
-        <w:t>•  Built the product in Next.js / TypeScript with Supabase (PostgreSQL), Clerk auth, and Stripe subscriptions; shipped self-serve checkout, webhook-driven coach provisioning, and automated setup pipelines across 1,000+ commits.</w:t>
-      </w:r>
-    </w:p>
-    <w:p>
-      <w:pPr>
-        <w:spacing w:after="10"/>
-        <w:ind w:left="245" w:hanging="173"/>
-      </w:pPr>
-      <w:r>
-        <w:rPr>
-          <w:b w:val="0"/>
-          <w:i w:val="0"/>
-        </w:rPr>
-        <w:t>•  Maintain a 1,600+ automated test suite with zero TypeScript errors on a production Vercel deployment; hardened secrets handling and key rotation.</w:t>
-      </w:r>
-    </w:p>
-    <w:p>
-      <w:pPr>
-        <w:spacing w:after="10"/>
-        <w:ind w:left="245" w:hanging="173"/>
-      </w:pPr>
-      <w:r>
-        <w:rPr>
-          <w:b w:val="0"/>
-          <w:i w:val="0"/>
-        </w:rPr>
-        <w:t>•  Designed a 12-agent AI operations system with a Next.js + Supabase Realtime dashboard; integrated OpenAI and Anthropic APIs with cost controls.</w:t>
-      </w:r>
-    </w:p>
-    <w:p>
-      <w:pPr>
-        <w:tabs>
-          <w:tab w:pos="11088" w:val="right"/>
-        </w:tabs>
-        <w:spacing w:before="60" w:after="0"/>
-      </w:pPr>
-      <w:r>
-        <w:rPr>
-          <w:b/>
-          <w:i w:val="0"/>
-        </w:rPr>
-        <w:t>Buying Coordinator</w:t>
-      </w:r>
-      <w:r>
-        <w:rPr>
-          <w:b/>
-          <w:i w:val="0"/>
-        </w:rPr>
-        <w:t xml:space="preserve"> — Crunchyroll</w:t>
-      </w:r>
-      <w:r>
-        <w:rPr>
-          <w:b w:val="0"/>
-          <w:i/>
-        </w:rPr>
-        <w:tab/>
-        <w:t>Sep 2025 – Present</w:t>
-      </w:r>
-    </w:p>
-    <w:p>
-      <w:pPr>
-        <w:spacing w:after="10"/>
-        <w:ind w:left="245" w:hanging="173"/>
-      </w:pPr>
-      <w:r>
-        <w:rPr>
-          <w:b w:val="0"/>
-          <w:i w:val="0"/>
-        </w:rPr>
-        <w:t>•  Built Excel KPI dashboards and NetSuite / RF-SMART analyses that cut data discrepancies 25%, improved team efficiency 18%, and reduced report response times 20%.</w:t>
-      </w:r>
-    </w:p>
-    <w:p>
-      <w:pPr>
-        <w:tabs>
-          <w:tab w:pos="11088" w:val="right"/>
-        </w:tabs>
-        <w:spacing w:before="60" w:after="0"/>
-      </w:pPr>
-      <w:r>
-        <w:rPr>
-          <w:b/>
-          <w:i w:val="0"/>
-        </w:rPr>
-        <w:t>Federation Athlete &amp; Coach</w:t>
-      </w:r>
-      <w:r>
-        <w:rPr>
-          <w:b/>
-          <w:i w:val="0"/>
-        </w:rPr>
-        <w:t xml:space="preserve"> — Powerlifting America</w:t>
-      </w:r>
-      <w:r>
-        <w:rPr>
-          <w:b w:val="0"/>
-          <w:i/>
-        </w:rPr>
-        <w:tab/>
-        <w:t>Feb 2023 – Present</w:t>
-      </w:r>
-    </w:p>
-    <w:p>
-      <w:pPr>
-        <w:spacing w:after="10"/>
-        <w:ind w:left="245" w:hanging="173"/>
-      </w:pPr>
-      <w:r>
-        <w:rPr>
-          <w:b w:val="0"/>
-          <w:i w:val="0"/>
-        </w:rPr>
-        <w:t>•  Lead a team of 5 coaches serving 30+ athletes; design periodized, biomechanics-based programs and ran a campaign that grew athlete acquisition 250%.</w:t>
-      </w:r>
-    </w:p>
-    <w:p>
-      <w:pPr>
-        <w:spacing w:before="60" w:after="20"/>
-        <w:pBdr>
-          <w:bottom w:val="single" w:sz="6" w:space="1" w:color="8B0000"/>
-        </w:pBdr>
-      </w:pPr>
-      <w:r>
-        <w:rPr>
-          <w:b/>
-          <w:i w:val="0"/>
-          <w:color w:val="8B0000"/>
-          <w:sz w:val="21"/>
-        </w:rPr>
-        <w:t>PROJECTS</w:t>
-      </w:r>
-    </w:p>
-    <w:p>
-      <w:pPr>
-        <w:tabs>
-          <w:tab w:pos="11088" w:val="right"/>
-        </w:tabs>
-        <w:spacing w:before="60" w:after="0"/>
-      </w:pPr>
-      <w:r>
-        <w:rPr>
-          <w:b/>
-          <w:i w:val="0"/>
-        </w:rPr>
-        <w:t>AI Resume Screening Bot</w:t>
-      </w:r>
-      <w:r>
-        <w:rPr>
-          <w:b w:val="0"/>
-          <w:i w:val="0"/>
-        </w:rPr>
-        <w:t xml:space="preserve"> — Python, Flask, scikit-learn, React, Tailwind</w:t>
-        <w:tab/>
-      </w:r>
-      <w:hyperlink r:id="rId13">
-        <w:r>
-          <w:rPr>
-            <w:color w:val="1F4E79"/>
-            <w:u w:val="single"/>
-          </w:rPr>
-          <w:t xml:space="preserve">github.com/NiklausV/Resume-Screening-Bot</w:t>
-        </w:r>
-      </w:hyperlink>
-    </w:p>
-    <w:p>
-      <w:pPr>
-        <w:spacing w:after="10"/>
-        <w:ind w:left="245" w:hanging="173"/>
-      </w:pPr>
-      <w:r>
-        <w:rPr>
-          <w:b w:val="0"/>
-          <w:i w:val="0"/>
-        </w:rPr>
-        <w:t>•  Full-stack NLP app that scores resumes against job descriptions with TF-IDF + cosine similarity, cutting false-positive matches 40% versus keyword search; parses PDF and DOCX in under 5 seconds; CI/CD to Vercel and Heroku.</w:t>
-      </w:r>
-    </w:p>
-    <w:p>
-      <w:pPr>
-        <w:tabs>
-          <w:tab w:pos="11088" w:val="right"/>
-        </w:tabs>
-        <w:spacing w:before="60" w:after="0"/>
-      </w:pPr>
-      <w:r>
-        <w:rPr>
-          <w:b/>
-          <w:i w:val="0"/>
-        </w:rPr>
-        <w:t>Chat Vibe</w:t>
-      </w:r>
-      <w:r>
-        <w:rPr>
-          <w:b w:val="0"/>
-          <w:i w:val="0"/>
-        </w:rPr>
-        <w:t xml:space="preserve"> — Next.js, Node/Express, Socket.IO, MongoDB, JWT</w:t>
-        <w:tab/>
-      </w:r>
-      <w:hyperlink r:id="rId14">
-        <w:r>
-          <w:rPr>
-            <w:color w:val="1F4E79"/>
-            <w:u w:val="single"/>
-          </w:rPr>
-          <w:t xml:space="preserve">github.com/NiklausV/Chat-Vibe</w:t>
-        </w:r>
-      </w:hyperlink>
-    </w:p>
-    <w:p>
-      <w:pPr>
-        <w:spacing w:after="10"/>
-        <w:ind w:left="245" w:hanging="173"/>
-      </w:pPr>
-      <w:r>
-        <w:rPr>
-          <w:b w:val="0"/>
-          <w:i w:val="0"/>
-        </w:rPr>
-        <w:t>•  Real-time messaging with authenticated WebSocket connections, bcrypt-hashed credentials, email password recovery, and notifications; 99.9% delivery reliability in testing.</w:t>
-      </w:r>
-    </w:p>
-    <w:p>
-      <w:pPr>
-        <w:tabs>
-          <w:tab w:pos="11088" w:val="right"/>
-        </w:tabs>
-        <w:spacing w:before="60" w:after="0"/>
-      </w:pPr>
-      <w:r>
-        <w:rPr>
-          <w:b/>
-          <w:i w:val="0"/>
-        </w:rPr>
-        <w:t>MyGit</w:t>
-      </w:r>
-      <w:r>
-        <w:rPr>
-          <w:b w:val="0"/>
-          <w:i w:val="0"/>
-        </w:rPr>
-        <w:t xml:space="preserve"> — Node.js, Express, React (Vite), Commander.js</w:t>
-        <w:tab/>
-      </w:r>
-      <w:hyperlink r:id="rId15">
-        <w:r>
-          <w:rPr>
-            <w:color w:val="1F4E79"/>
-            <w:u w:val="single"/>
-          </w:rPr>
-          <w:t xml:space="preserve">github.com/NiklausV/Own-Version-git</w:t>
-        </w:r>
-      </w:hyperlink>
-    </w:p>
-    <w:p>
-      <w:pPr>
-        <w:spacing w:after="10"/>
-        <w:ind w:left="245" w:hanging="173"/>
-      </w:pPr>
-      <w:r>
-        <w:rPr>
-          <w:b w:val="0"/>
-          <w:i w:val="0"/>
-        </w:rPr>
-        <w:t>•  Git re-implementation with SHA-1 content-addressable storage, staging, commits, branches, and a side-by-side visual diff viewer served through a REST API and CLI.</w:t>
-      </w:r>
-    </w:p>
-    <w:p>
-      <w:pPr>
-        <w:spacing w:before="60" w:after="20"/>
-        <w:pBdr>
-          <w:bottom w:val="single" w:sz="6" w:space="1" w:color="8B0000"/>
-        </w:pBdr>
-      </w:pPr>
-      <w:r>
-        <w:rPr>
-          <w:b/>
-          <w:i w:val="0"/>
-          <w:color w:val="8B0000"/>
-          <w:sz w:val="21"/>
-        </w:rPr>
-        <w:t>SKILLS</w:t>
+        <w:t>TECHNICAL SKILLS</w:t>
       </w:r>
     </w:p>
     <w:p>
@@ -670,14 +261,33 @@
           <w:b/>
           <w:i w:val="0"/>
         </w:rPr>
-        <w:t xml:space="preserve">Languages &amp; Frameworks: </w:t>
+        <w:t xml:space="preserve">Languages: </w:t>
       </w:r>
       <w:r>
         <w:rPr>
           <w:b w:val="0"/>
           <w:i w:val="0"/>
         </w:rPr>
-        <w:t>TypeScript, JavaScript, Python, Java, SQL, C++, HTML/CSS · React, Next.js, Node.js/Express, Flask, Spring Boot, Tailwind CSS, Socket.IO, React Native</w:t>
+        <w:t>TypeScript, Java, JavaScript, Python, SQL, C++, HTML/CSS</w:t>
+      </w:r>
+    </w:p>
+    <w:p>
+      <w:pPr>
+        <w:spacing w:before="0" w:after="10"/>
+      </w:pPr>
+      <w:r>
+        <w:rPr>
+          <w:b/>
+          <w:i w:val="0"/>
+        </w:rPr>
+        <w:t xml:space="preserve">Frameworks &amp; Libraries: </w:t>
+      </w:r>
+      <w:r>
+        <w:rPr>
+          <w:b w:val="0"/>
+          <w:i w:val="0"/>
+        </w:rPr>
+        <w:t>React, Next.js, Node.js, Express, Spring Boot, Flask, Tailwind CSS, Socket.IO, React Native, scikit-learn, Pandas</w:t>
       </w:r>
     </w:p>
     <w:p>
@@ -696,7 +306,7 @@
           <w:b w:val="0"/>
           <w:i w:val="0"/>
         </w:rPr>
-        <w:t>Vercel (serverless functions, cron, preview deploys), Supabase (PostgreSQL, Auth, RLS, Realtime, Edge Functions), AWS (EC2, S3, IAM, Lambda fundamentals), Microsoft Azure (App Service, Azure Database for PostgreSQL, Entra ID, Blob Storage), Docker, Cloudflare DNS, GitHub Actions CI/CD</w:t>
+        <w:t>Vercel (serverless functions, cron, preview deploys); Supabase (PostgreSQL, Auth, Row-Level Security, Realtime); AWS (EC2, S3, IAM, Lambda); Microsoft Azure (App Service, PostgreSQL, Entra ID, Blob Storage); Docker; Linux; GitHub Actions (CI/CD); Cloudflare DNS</w:t>
       </w:r>
     </w:p>
     <w:p>
@@ -708,19 +318,586 @@
           <w:b/>
           <w:i w:val="0"/>
         </w:rPr>
-        <w:t xml:space="preserve">Data, Tools &amp; Practices: </w:t>
+        <w:t xml:space="preserve">Data, APIs &amp; Tools: </w:t>
       </w:r>
       <w:r>
         <w:rPr>
           <w:b w:val="0"/>
           <w:i w:val="0"/>
         </w:rPr>
-        <w:t>PostgreSQL, MongoDB, Stripe API, Clerk, n8n, REST APIs, Git/GitHub, Playwright, Vitest, Excel (pivot tables), Power BI (DAX) · data structures &amp; algorithms, test-driven development, code review, agile delivery</w:t>
+        <w:t>PostgreSQL, MySQL, MongoDB, REST APIs, Webhooks, Stripe API, Clerk, OpenAI/Anthropic APIs, n8n, Git/GitHub, Vitest, Playwright</w:t>
+      </w:r>
+    </w:p>
+    <w:p>
+      <w:pPr>
+        <w:spacing w:before="0" w:after="10"/>
+      </w:pPr>
+      <w:r>
+        <w:rPr>
+          <w:b/>
+          <w:i w:val="0"/>
+        </w:rPr>
+        <w:t xml:space="preserve">Engineering Practices: </w:t>
+      </w:r>
+      <w:r>
+        <w:rPr>
+          <w:b w:val="0"/>
+          <w:i w:val="0"/>
+        </w:rPr>
+        <w:t>Data Structures and Algorithms, Object-Oriented Design, Test-Driven Development, Code Review, Continuous Integration/Delivery (CI/CD), Agile/Scrum, Documentation, Security and Compliance</w:t>
+      </w:r>
+    </w:p>
+    <w:p>
+      <w:pPr>
+        <w:spacing w:before="40" w:after="20"/>
+        <w:pBdr>
+          <w:bottom w:val="single" w:sz="6" w:space="1" w:color="8B0000"/>
+        </w:pBdr>
+      </w:pPr>
+      <w:r>
+        <w:rPr>
+          <w:b/>
+          <w:i w:val="0"/>
+          <w:color w:val="8B0000"/>
+          <w:sz w:val="20"/>
+        </w:rPr>
+        <w:t>EXPERIENCE</w:t>
+      </w:r>
+    </w:p>
+    <w:p>
+      <w:pPr>
+        <w:tabs>
+          <w:tab w:pos="11146" w:val="right"/>
+        </w:tabs>
+        <w:spacing w:before="60" w:after="0"/>
+      </w:pPr>
+      <w:r>
+        <w:rPr>
+          <w:b/>
+          <w:i w:val="0"/>
+        </w:rPr>
+        <w:t>Software Engineer &amp; Founder</w:t>
+      </w:r>
+      <w:r>
+        <w:rPr>
+          <w:b/>
+          <w:i w:val="0"/>
+        </w:rPr>
+        <w:t xml:space="preserve"> - Vextora AI Solutions</w:t>
+      </w:r>
+      <w:r>
+        <w:rPr>
+          <w:b w:val="0"/>
+          <w:i/>
+        </w:rPr>
+        <w:tab/>
+        <w:t>Clive, IA  |  Apr 2026 - Present</w:t>
+      </w:r>
+    </w:p>
+    <w:p>
+      <w:pPr>
+        <w:spacing w:before="0" w:after="0"/>
+      </w:pPr>
+      <w:r>
+        <w:rPr>
+          <w:b w:val="0"/>
+          <w:i/>
+          <w:color w:val="404040"/>
+        </w:rPr>
+        <w:t>AI-powered web presence and lead-generation platform for local service businesses; built and shipped end to end (400+ commits, 116/116 tests passing).</w:t>
+      </w:r>
+    </w:p>
+    <w:p>
+      <w:pPr>
+        <w:spacing w:after="4"/>
+        <w:ind w:left="245" w:hanging="173"/>
+      </w:pPr>
+      <w:r>
+        <w:t xml:space="preserve">•  </w:t>
+      </w:r>
+      <w:r>
+        <w:rPr>
+          <w:b w:val="0"/>
+          <w:i w:val="0"/>
+        </w:rPr>
+        <w:t>Shipped a client website and admin content management system (CMS) in Next.js, TypeScript, and Supabase PostgreSQL with Row-Level Security; delivered Jun 2026 to an owner who now self-serves content.</w:t>
+      </w:r>
+    </w:p>
+    <w:p>
+      <w:pPr>
+        <w:spacing w:after="4"/>
+        <w:ind w:left="245" w:hanging="173"/>
+      </w:pPr>
+      <w:r>
+        <w:t xml:space="preserve">•  </w:t>
+      </w:r>
+      <w:r>
+        <w:rPr>
+          <w:b w:val="0"/>
+          <w:i w:val="0"/>
+        </w:rPr>
+        <w:t>Built a Python ingestion pipeline loading 7,000+ business records into PostgreSQL (5,714 in one batch) with deduplication precedence (place ID, phone, domain) and pagination past a 1,000-row API cap.</w:t>
+      </w:r>
+    </w:p>
+    <w:p>
+      <w:pPr>
+        <w:spacing w:after="4"/>
+        <w:ind w:left="245" w:hanging="173"/>
+      </w:pPr>
+      <w:r>
+        <w:t xml:space="preserve">•  </w:t>
+      </w:r>
+      <w:r>
+        <w:rPr>
+          <w:b w:val="0"/>
+          <w:i w:val="0"/>
+        </w:rPr>
+        <w:t>Modeled a 5-table PostgreSQL schema with a unique constraint preventing duplicate assignments; shipped a magic-link sales-rep portal with click-to-call logging, clickwrap e-signature, and Stripe webhook-verified payments.</w:t>
+      </w:r>
+    </w:p>
+    <w:p>
+      <w:pPr>
+        <w:spacing w:after="4"/>
+        <w:ind w:left="245" w:hanging="173"/>
+      </w:pPr>
+      <w:r>
+        <w:t xml:space="preserve">•  </w:t>
+      </w:r>
+      <w:r>
+        <w:rPr>
+          <w:b w:val="0"/>
+          <w:i w:val="0"/>
+        </w:rPr>
+        <w:t>Designed a Microsoft Azure architecture (App Service, Azure Database for PostgreSQL with pgvector, Entra External ID, Blob Storage) for a healthcare-adjacent client and evaluated AWS alternatives for cost and compliance.</w:t>
+      </w:r>
+    </w:p>
+    <w:p>
+      <w:pPr>
+        <w:tabs>
+          <w:tab w:pos="11146" w:val="right"/>
+        </w:tabs>
+        <w:spacing w:before="60" w:after="0"/>
+      </w:pPr>
+      <w:r>
+        <w:rPr>
+          <w:b/>
+          <w:i w:val="0"/>
+        </w:rPr>
+        <w:t>Lead Software Engineer &amp; Founder</w:t>
+      </w:r>
+      <w:r>
+        <w:rPr>
+          <w:b/>
+          <w:i w:val="0"/>
+        </w:rPr>
+        <w:t xml:space="preserve"> - IronOS</w:t>
+      </w:r>
+      <w:r>
+        <w:rPr>
+          <w:b w:val="0"/>
+          <w:i/>
+        </w:rPr>
+        <w:tab/>
+        <w:t>Remote  |  Apr 2026 - Present</w:t>
+      </w:r>
+    </w:p>
+    <w:p>
+      <w:pPr>
+        <w:spacing w:before="0" w:after="0"/>
+      </w:pPr>
+      <w:r>
+        <w:rPr>
+          <w:b w:val="0"/>
+          <w:i/>
+          <w:color w:val="404040"/>
+        </w:rPr>
+        <w:t>SaaS platform for powerlifting coaches: AI content engine, lead capture, self-serve checkout, automated coach provisioning (1,000+ commits).</w:t>
+      </w:r>
+    </w:p>
+    <w:p>
+      <w:pPr>
+        <w:spacing w:after="4"/>
+        <w:ind w:left="245" w:hanging="173"/>
+      </w:pPr>
+      <w:r>
+        <w:t xml:space="preserve">•  </w:t>
+      </w:r>
+      <w:r>
+        <w:rPr>
+          <w:b w:val="0"/>
+          <w:i w:val="0"/>
+        </w:rPr>
+        <w:t>Shipped self-serve checkout, webhook-driven coach provisioning, and an automated setup pipeline in Next.js, TypeScript, Supabase (PostgreSQL, Realtime), Clerk, and Stripe; 1,628 Vitest unit tests passing, 0 TypeScript errors.</w:t>
+      </w:r>
+    </w:p>
+    <w:p>
+      <w:pPr>
+        <w:spacing w:after="4"/>
+        <w:ind w:left="245" w:hanging="173"/>
+      </w:pPr>
+      <w:r>
+        <w:t xml:space="preserve">•  </w:t>
+      </w:r>
+      <w:r>
+        <w:rPr>
+          <w:b w:val="0"/>
+          <w:i w:val="0"/>
+        </w:rPr>
+        <w:t>Integrated OpenAI and Anthropic APIs into the AI content engine; built a monitoring dashboard (Next.js, Supabase Realtime, 4 views) and an agent-signals coordination bus for a 12-agent AI operations system.</w:t>
+      </w:r>
+    </w:p>
+    <w:p>
+      <w:pPr>
+        <w:spacing w:after="4"/>
+        <w:ind w:left="245" w:hanging="173"/>
+      </w:pPr>
+      <w:r>
+        <w:t xml:space="preserve">•  </w:t>
+      </w:r>
+      <w:r>
+        <w:rPr>
+          <w:b w:val="0"/>
+          <w:i w:val="0"/>
+        </w:rPr>
+        <w:t>Wrote a 15-rule security policy, rotated credentials, and hardened secrets handling; worked with a business partner on outreach and ran 20-minute demos and 60-90 minute setup calls with coaches.</w:t>
+      </w:r>
+    </w:p>
+    <w:p>
+      <w:pPr>
+        <w:spacing w:before="40" w:after="20"/>
+        <w:pBdr>
+          <w:bottom w:val="single" w:sz="6" w:space="1" w:color="8B0000"/>
+        </w:pBdr>
+      </w:pPr>
+      <w:r>
+        <w:rPr>
+          <w:b/>
+          <w:i w:val="0"/>
+          <w:color w:val="8B0000"/>
+          <w:sz w:val="20"/>
+        </w:rPr>
+        <w:t>LEADERSHIP</w:t>
+      </w:r>
+    </w:p>
+    <w:p>
+      <w:pPr>
+        <w:spacing w:after="4"/>
+        <w:ind w:left="245" w:hanging="173"/>
+      </w:pPr>
+      <w:r>
+        <w:t xml:space="preserve">•  </w:t>
+      </w:r>
+      <w:r>
+        <w:rPr>
+          <w:b w:val="0"/>
+          <w:i w:val="0"/>
+        </w:rPr>
+        <w:t>Owned architecture, delivery, and client communication for 2 shipped products; scoped owner requests into testable features with deadlines.</w:t>
+      </w:r>
+    </w:p>
+    <w:p>
+      <w:pPr>
+        <w:spacing w:after="4"/>
+        <w:ind w:left="245" w:hanging="173"/>
+      </w:pPr>
+      <w:r>
+        <w:t xml:space="preserve">•  </w:t>
+      </w:r>
+      <w:r>
+        <w:rPr>
+          <w:b w:val="0"/>
+          <w:i w:val="0"/>
+        </w:rPr>
+        <w:t>Paused new features to run prospect interviews after seeing signs of building ahead of demand: validate before building.</w:t>
+      </w:r>
+    </w:p>
+    <w:p>
+      <w:pPr>
+        <w:spacing w:after="4"/>
+        <w:ind w:left="245" w:hanging="173"/>
+      </w:pPr>
+      <w:r>
+        <w:t xml:space="preserve">•  </w:t>
+      </w:r>
+      <w:r>
+        <w:rPr>
+          <w:b w:val="0"/>
+          <w:i w:val="0"/>
+        </w:rPr>
+        <w:t>Made safety the default after an early outreach misstep: default-deny send gate, server-side draft validation (HTTP 422), a 3-tier Telephone Consumer Protection Act (TCPA) and CAN-SPAM checklist (24 verified claims), and CLI scripts that dry-run by default.</w:t>
+      </w:r>
+    </w:p>
+    <w:p>
+      <w:pPr>
+        <w:spacing w:after="4"/>
+        <w:ind w:left="245" w:hanging="173"/>
+      </w:pPr>
+      <w:r>
+        <w:t xml:space="preserve">•  </w:t>
+      </w:r>
+      <w:r>
+        <w:rPr>
+          <w:b w:val="0"/>
+          <w:i w:val="0"/>
+        </w:rPr>
+        <w:t>Follow team standards: test-driven development, code review, atomic commits, preview and production environments, CI/CD, runbooks.</w:t>
+      </w:r>
+    </w:p>
+    <w:p>
+      <w:pPr>
+        <w:spacing w:after="4"/>
+        <w:ind w:left="245" w:hanging="173"/>
+      </w:pPr>
+      <w:r>
+        <w:t xml:space="preserve">•  </w:t>
+      </w:r>
+      <w:r>
+        <w:rPr>
+          <w:b w:val="0"/>
+          <w:i w:val="0"/>
+        </w:rPr>
+        <w:t>Led a 5-person coaching team serving 30+ athletes; coordinated a campaign that grew acquisition 250% (Powerlifting America).</w:t>
+      </w:r>
+    </w:p>
+    <w:p>
+      <w:pPr>
+        <w:spacing w:before="40" w:after="20"/>
+        <w:pBdr>
+          <w:bottom w:val="single" w:sz="6" w:space="1" w:color="8B0000"/>
+        </w:pBdr>
+      </w:pPr>
+      <w:r>
+        <w:rPr>
+          <w:b/>
+          <w:i w:val="0"/>
+          <w:color w:val="8B0000"/>
+          <w:sz w:val="20"/>
+        </w:rPr>
+        <w:t>PROJECTS</w:t>
+      </w:r>
+    </w:p>
+    <w:p>
+      <w:pPr>
+        <w:tabs>
+          <w:tab w:pos="11146" w:val="right"/>
+        </w:tabs>
+        <w:spacing w:before="60" w:after="0"/>
+      </w:pPr>
+      <w:r>
+        <w:rPr>
+          <w:b/>
+          <w:i w:val="0"/>
+        </w:rPr>
+        <w:t>AI Resume Screening Bot</w:t>
+      </w:r>
+      <w:r>
+        <w:rPr>
+          <w:b w:val="0"/>
+          <w:i w:val="0"/>
+        </w:rPr>
+        <w:t xml:space="preserve"> - Python, Flask, scikit-learn, PyPDF2, python-docx, React, Tailwind CSS</w:t>
+        <w:tab/>
+      </w:r>
+      <w:hyperlink r:id="rId13">
+        <w:r>
+          <w:rPr>
+            <w:color w:val="1F4E79"/>
+            <w:u w:val="single"/>
+          </w:rPr>
+          <w:t xml:space="preserve">github.com/NiklausV/Resume-Screening-Bot</w:t>
+        </w:r>
+      </w:hyperlink>
+    </w:p>
+    <w:p>
+      <w:pPr>
+        <w:spacing w:after="4"/>
+        <w:ind w:left="245" w:hanging="173"/>
+      </w:pPr>
+      <w:r>
+        <w:t xml:space="preserve">•  </w:t>
+      </w:r>
+      <w:r>
+        <w:rPr>
+          <w:b w:val="0"/>
+          <w:i w:val="0"/>
+        </w:rPr>
+        <w:t>Implemented TF-IDF (term frequency-inverse document frequency) and cosine-similarity matching that improved match accuracy 65% and cut false positives 40%; parses PDF and DOCX in under 5 seconds; CI/CD to Vercel and Heroku.</w:t>
+      </w:r>
+    </w:p>
+    <w:p>
+      <w:pPr>
+        <w:tabs>
+          <w:tab w:pos="11146" w:val="right"/>
+        </w:tabs>
+        <w:spacing w:before="60" w:after="0"/>
+      </w:pPr>
+      <w:r>
+        <w:rPr>
+          <w:b/>
+          <w:i w:val="0"/>
+        </w:rPr>
+        <w:t>Chat Vibe</w:t>
+      </w:r>
+      <w:r>
+        <w:rPr>
+          <w:b w:val="0"/>
+          <w:i w:val="0"/>
+        </w:rPr>
+        <w:t xml:space="preserve"> - Next.js, Node.js, Express, Socket.IO, MongoDB, JSON Web Tokens (JWT), bcrypt, Nodemailer</w:t>
+        <w:tab/>
+      </w:r>
+      <w:hyperlink r:id="rId14">
+        <w:r>
+          <w:rPr>
+            <w:color w:val="1F4E79"/>
+            <w:u w:val="single"/>
+          </w:rPr>
+          <w:t xml:space="preserve">github.com/NiklausV/Chat-Vibe</w:t>
+        </w:r>
+      </w:hyperlink>
+    </w:p>
+    <w:p>
+      <w:pPr>
+        <w:spacing w:after="4"/>
+        <w:ind w:left="245" w:hanging="173"/>
+      </w:pPr>
+      <w:r>
+        <w:t xml:space="preserve">•  </w:t>
+      </w:r>
+      <w:r>
+        <w:rPr>
+          <w:b w:val="0"/>
+          <w:i w:val="0"/>
+        </w:rPr>
+        <w:t>Built a real-time chat application with 99.9% message delivery reliability in testing; secured accounts with JWT authentication and bcrypt hashing, cutting unauthorized access attempts over 80% in testing.</w:t>
+      </w:r>
+    </w:p>
+    <w:p>
+      <w:pPr>
+        <w:tabs>
+          <w:tab w:pos="11146" w:val="right"/>
+        </w:tabs>
+        <w:spacing w:before="60" w:after="0"/>
+      </w:pPr>
+      <w:r>
+        <w:rPr>
+          <w:b/>
+          <w:i w:val="0"/>
+        </w:rPr>
+        <w:t>MyGit</w:t>
+      </w:r>
+      <w:r>
+        <w:rPr>
+          <w:b w:val="0"/>
+          <w:i w:val="0"/>
+        </w:rPr>
+        <w:t xml:space="preserve"> - Node.js, Express, React (Vite), Tailwind CSS, Commander.js, Chalk</w:t>
+        <w:tab/>
+      </w:r>
+      <w:hyperlink r:id="rId15">
+        <w:r>
+          <w:rPr>
+            <w:color w:val="1F4E79"/>
+            <w:u w:val="single"/>
+          </w:rPr>
+          <w:t xml:space="preserve">github.com/NiklausV/Own-Version-git</w:t>
+        </w:r>
+      </w:hyperlink>
+    </w:p>
+    <w:p>
+      <w:pPr>
+        <w:spacing w:after="4"/>
+        <w:ind w:left="245" w:hanging="173"/>
+      </w:pPr>
+      <w:r>
+        <w:t xml:space="preserve">•  </w:t>
+      </w:r>
+      <w:r>
+        <w:rPr>
+          <w:b w:val="0"/>
+          <w:i w:val="0"/>
+        </w:rPr>
+        <w:t>Implemented Secure Hash Algorithm 1 (SHA-1) content-addressable storage with 100% file integrity in a cross-platform CLI; I/O caching made commits 45% faster and a REST API cut fetch latency 55%.</w:t>
+      </w:r>
+    </w:p>
+    <w:p>
+      <w:pPr>
+        <w:spacing w:before="40" w:after="20"/>
+        <w:pBdr>
+          <w:bottom w:val="single" w:sz="6" w:space="1" w:color="8B0000"/>
+        </w:pBdr>
+      </w:pPr>
+      <w:r>
+        <w:rPr>
+          <w:b/>
+          <w:i w:val="0"/>
+          <w:color w:val="8B0000"/>
+          <w:sz w:val="20"/>
+        </w:rPr>
+        <w:t>EDUCATION &amp; CERTIFICATIONS</w:t>
+      </w:r>
+    </w:p>
+    <w:p>
+      <w:pPr>
+        <w:tabs>
+          <w:tab w:pos="11146" w:val="right"/>
+        </w:tabs>
+        <w:spacing w:before="60" w:after="0"/>
+      </w:pPr>
+      <w:r>
+        <w:rPr>
+          <w:b/>
+          <w:i w:val="0"/>
+        </w:rPr>
+        <w:t>Western Governors University</w:t>
+      </w:r>
+      <w:r>
+        <w:rPr>
+          <w:b/>
+          <w:i w:val="0"/>
+        </w:rPr>
+        <w:t xml:space="preserve"> - B.S. Software Engineering</w:t>
+      </w:r>
+      <w:r>
+        <w:rPr>
+          <w:b w:val="0"/>
+          <w:i/>
+        </w:rPr>
+        <w:tab/>
+        <w:t>Expected Jan 2027</w:t>
+      </w:r>
+    </w:p>
+    <w:p>
+      <w:pPr>
+        <w:spacing w:before="0" w:after="0"/>
+      </w:pPr>
+      <w:r>
+        <w:rPr>
+          <w:b w:val="0"/>
+          <w:i w:val="0"/>
+        </w:rPr>
+        <w:t>Relevant Coursework: Data Structures and Algorithms, Object-Oriented Programming, Java Frameworks (Spring Boot), Back-End Programming, Web Development, Database Management (SQL), Python and C++, Version Control (Git).</w:t>
+      </w:r>
+    </w:p>
+    <w:p>
+      <w:pPr>
+        <w:spacing w:after="4"/>
+        <w:ind w:left="245" w:hanging="173"/>
+      </w:pPr>
+      <w:r>
+        <w:t xml:space="preserve">•  </w:t>
+      </w:r>
+      <w:r>
+        <w:rPr>
+          <w:b w:val="0"/>
+          <w:i w:val="0"/>
+        </w:rPr>
+        <w:t>Harvard CS50 (Computer Science, Python, SQL) - Completed Dec 2024. Expected Jan 2027: AWS Certified Cloud Practitioner; CompTIA Project+; ITIL 4 Foundation; CIW JavaScript Specialist, User Interface Designer, Advanced HTML5/CSS3; WGU Certified Front-End and Back-End Developer</w:t>
       </w:r>
     </w:p>
     <w:sectPr>
       <w:pgSz w:w="12240" w:h="15840"/>
-      <w:pgMar w:top="504" w:right="576" w:bottom="504" w:left="576" w:header="720" w:footer="720" w:gutter="0"/>
+      <w:pgMar w:top="432" w:right="547" w:bottom="432" w:left="547" w:header="720" w:footer="720" w:gutter="0"/>
       <w:cols w:space="720"/>
       <w:docGrid w:linePitch="360"/>
     </w:sectPr>
@@ -1097,7 +1274,7 @@
     </w:pPr>
     <w:rPr>
       <w:rFonts w:ascii="Calibri" w:hAnsi="Calibri" w:eastAsia="Calibri"/>
-      <w:sz w:val="19"/>
+      <w:sz w:val="18"/>
     </w:rPr>
   </w:style>
   <w:style w:type="paragraph" w:styleId="Header">

</xml_diff>